<commit_message>
StegaGuard: update paper, supplementary and reports from the full 600-cover rerun
- results_data: ΔAUC intervals recomputed from the rerun scores (B = 10,000, default_rng(2026),
  one draw shared by the three seeds); per-seed false positives. Point estimates unchanged; bounds move
  by at most 0.003; the Residual-LR P3 WOW interval now reaches zero (17/18 below zero).
- Paper: 3.2 SRM score, 3.5 bootstrap details, intervals in Abstract/Sect. 4/Conclusion/Tables 5-6,
  Table 7 caption, Fig. 2 redrawn, [20] sealwatch version 2025.9. Still 12 pages; checker OK.
- Supplementary: S2 method note, S3 per-seed false positives, software versions.
- data/stegaguard_600/ket_qua_chay_lai: per-image scores, thresholds, CI file, verify_stats report.
- Reports and the message to the professor rewritten with the rerun results.

Co-Authored-By: Claude Opus 5.5 <noreply@anthropic.com>
Claude-Session: https://claude.ai/code/session_01N5hfqEt1Nergf7js5PTLwW
</commit_message>
<xml_diff>
--- a/supplementary/StegaGuard_supplementary.docx
+++ b/supplementary/StegaGuard_supplementary.docx
@@ -6897,7 +6897,7 @@
         <w:pStyle w:val="p1a"/>
       </w:pPr>
       <w:r>
-        <w:t xml:space="preserve">Residual-LR shows a seed SD of 0.000 under P1, consistent with P1 involving no variant sampling and a deterministic fit. The FPR column is constant within each detector and protocol because the 120 test covers are scored identically in all six stego conditions. Multiplying the FPR by 3 × 120 and rounding to the nearest integer gives the false-positive totals of the manuscript (e.g. 0.042 → 15/360).</w:t>
+        <w:t xml:space="preserve">Residual-LR shows a seed SD of 0.000 under P1, consistent with P1 involving no variant sampling and a deterministic fit. The FPR column is constant within each detector and protocol because the 120 test covers are scored identically in all six stego conditions. Table S3 lists the false positives behind each rate per run.</w:t>
       </w:r>
     </w:p>
     <w:p>
@@ -6913,7 +6913,7 @@
         <w:t xml:space="preserve">Table S2.</w:t>
       </w:r>
       <w:r>
-        <w:t xml:space="preserve"> Payload-shift comparisons (RQ3). ΔAUC = AUC(0.1 bpp) − AUC(0.4 bpp), paired on the 120 test covers, with 95% paired bootstrap intervals (resampling unit: source cover). ΔAUC is computed from unrounded AUCs and may differ by 0.001 from the rounded columns.</w:t>
+        <w:t xml:space="preserve"> Payload-shift comparisons (RQ3). ΔAUC = AUC(0.1 bpp) − AUC(0.4 bpp), paired on the 120 test covers, with 95% paired bootstrap intervals (resampling unit: source cover; one draw shared by the three seeds; B = 10,000; see Sect. 3.5 of the manuscript). ΔAUC is computed from unrounded AUCs and may differ by 0.001 from the rounded columns.</w:t>
       </w:r>
     </w:p>
     <w:tbl>
@@ -7277,7 +7277,7 @@
                 <w:sz w:val="16"/>
                 <w:szCs w:val="16"/>
               </w:rPr>
-              <w:t xml:space="preserve">[−0.063, −0.008]</w:t>
+              <w:t xml:space="preserve">[−0.064, −0.007]</w:t>
             </w:r>
           </w:p>
         </w:tc>
@@ -7415,7 +7415,7 @@
                 <w:sz w:val="16"/>
                 <w:szCs w:val="16"/>
               </w:rPr>
-              <w:t xml:space="preserve">[−0.096, −0.029]</w:t>
+              <w:t xml:space="preserve">[−0.093, −0.029]</w:t>
             </w:r>
           </w:p>
         </w:tc>
@@ -7553,7 +7553,7 @@
                 <w:sz w:val="16"/>
                 <w:szCs w:val="16"/>
               </w:rPr>
-              <w:t xml:space="preserve">[−0.093, −0.020]</w:t>
+              <w:t xml:space="preserve">[−0.095, −0.021]</w:t>
             </w:r>
           </w:p>
         </w:tc>
@@ -7719,7 +7719,7 @@
                 <w:sz w:val="16"/>
                 <w:szCs w:val="16"/>
               </w:rPr>
-              <w:t xml:space="preserve">[−0.058, −0.012]</w:t>
+              <w:t xml:space="preserve">[−0.058, −0.011]</w:t>
             </w:r>
           </w:p>
         </w:tc>
@@ -7995,7 +7995,7 @@
                 <w:sz w:val="16"/>
                 <w:szCs w:val="16"/>
               </w:rPr>
-              <w:t xml:space="preserve">[−0.072, −0.020]</w:t>
+              <w:t xml:space="preserve">[−0.074, −0.020]</w:t>
             </w:r>
           </w:p>
         </w:tc>
@@ -8161,7 +8161,7 @@
                 <w:sz w:val="16"/>
                 <w:szCs w:val="16"/>
               </w:rPr>
-              <w:t xml:space="preserve">[−0.046, −0.001]</w:t>
+              <w:t xml:space="preserve">[−0.046, 0.000]</w:t>
             </w:r>
           </w:p>
         </w:tc>
@@ -8299,7 +8299,7 @@
                 <w:sz w:val="16"/>
                 <w:szCs w:val="16"/>
               </w:rPr>
-              <w:t xml:space="preserve">[−0.078, −0.030]</w:t>
+              <w:t xml:space="preserve">[−0.079, −0.031]</w:t>
             </w:r>
           </w:p>
         </w:tc>
@@ -8437,7 +8437,7 @@
                 <w:sz w:val="16"/>
                 <w:szCs w:val="16"/>
               </w:rPr>
-              <w:t xml:space="preserve">[−0.064, −0.006]</w:t>
+              <w:t xml:space="preserve">[−0.065, −0.006]</w:t>
             </w:r>
           </w:p>
         </w:tc>
@@ -8610,7 +8610,7 @@
                 <w:sz w:val="16"/>
                 <w:szCs w:val="16"/>
               </w:rPr>
-              <w:t xml:space="preserve">[−0.206, −0.144]</w:t>
+              <w:t xml:space="preserve">[−0.207, −0.143]</w:t>
             </w:r>
           </w:p>
         </w:tc>
@@ -8748,7 +8748,7 @@
                 <w:sz w:val="16"/>
                 <w:szCs w:val="16"/>
               </w:rPr>
-              <w:t xml:space="preserve">[−0.186, −0.127]</w:t>
+              <w:t xml:space="preserve">[−0.188, −0.127]</w:t>
             </w:r>
           </w:p>
         </w:tc>
@@ -8886,7 +8886,7 @@
                 <w:sz w:val="16"/>
                 <w:szCs w:val="16"/>
               </w:rPr>
-              <w:t xml:space="preserve">[−0.149, −0.092]</w:t>
+              <w:t xml:space="preserve">[−0.149, −0.091]</w:t>
             </w:r>
           </w:p>
         </w:tc>
@@ -9190,7 +9190,7 @@
                 <w:sz w:val="16"/>
                 <w:szCs w:val="16"/>
               </w:rPr>
-              <w:t xml:space="preserve">[−0.211, −0.155]</w:t>
+              <w:t xml:space="preserve">[−0.212, −0.154]</w:t>
             </w:r>
           </w:p>
         </w:tc>
@@ -9328,7 +9328,7 @@
                 <w:sz w:val="16"/>
                 <w:szCs w:val="16"/>
               </w:rPr>
-              <w:t xml:space="preserve">[−0.150, −0.088]</w:t>
+              <w:t xml:space="preserve">[−0.149, −0.088]</w:t>
             </w:r>
           </w:p>
         </w:tc>
@@ -9494,7 +9494,7 @@
                 <w:sz w:val="16"/>
                 <w:szCs w:val="16"/>
               </w:rPr>
-              <w:t xml:space="preserve">[−0.168, −0.111]</w:t>
+              <w:t xml:space="preserve">[−0.170, −0.111]</w:t>
             </w:r>
           </w:p>
         </w:tc>
@@ -9632,7 +9632,7 @@
                 <w:sz w:val="16"/>
                 <w:szCs w:val="16"/>
               </w:rPr>
-              <w:t xml:space="preserve">[−0.177, −0.122]</w:t>
+              <w:t xml:space="preserve">[−0.178, −0.120]</w:t>
             </w:r>
           </w:p>
         </w:tc>
@@ -9763,7 +9763,7 @@
                 <w:sz w:val="16"/>
                 <w:szCs w:val="16"/>
               </w:rPr>
-              <w:t xml:space="preserve">[−0.145, −0.089]</w:t>
+              <w:t xml:space="preserve">[−0.144, −0.087]</w:t>
             </w:r>
           </w:p>
         </w:tc>
@@ -9787,7 +9787,7 @@
         <w:t xml:space="preserve">Table S3.</w:t>
       </w:r>
       <w:r>
-        <w:t xml:space="preserve"> False-positive counts implied by the reported mean test FPR at τ</w:t>
+        <w:t xml:space="preserve"> Test false positives at τ</w:t>
       </w:r>
       <w:r>
         <w:rPr>
@@ -9796,12 +9796,12 @@
         <w:t xml:space="preserve">low</w:t>
       </w:r>
       <w:r>
-        <w:t xml:space="preserve">. Each count is the unique integer k with k/360 rounding to the reported FPR; per-seed counts are not reported.</w:t>
+        <w:t xml:space="preserve"> per run (out of 120 test covers), counted from the per-image test scores of each run. The observed test FPR is the total over 3 × 120 cover evaluations.</w:t>
       </w:r>
     </w:p>
     <w:tbl>
       <w:tblPr>
-        <w:tblW w:w="6900" w:type="dxa"/>
+        <w:tblW w:w="6918" w:type="dxa"/>
         <w:jc w:val="center"/>
         <w:tblBorders>
           <w:top w:val="single" w:sz="8" w:space="0" w:color="000000"/>
@@ -9817,11 +9817,13 @@
         <w:tblLook w:val="0000"/>
       </w:tblPr>
       <w:tblGrid>
-        <w:gridCol w:w="1700"/>
-        <w:gridCol w:w="500"/>
-        <w:gridCol w:w="1500"/>
-        <w:gridCol w:w="1500"/>
-        <w:gridCol w:w="1700"/>
+        <w:gridCol w:w="1400"/>
+        <w:gridCol w:w="400"/>
+        <w:gridCol w:w="900"/>
+        <w:gridCol w:w="900"/>
+        <w:gridCol w:w="900"/>
+        <w:gridCol w:w="1200"/>
+        <w:gridCol w:w="1218"/>
       </w:tblGrid>
       <w:tr>
         <w:trPr>
@@ -9830,7 +9832,7 @@
         </w:trPr>
         <w:tc>
           <w:tcPr>
-            <w:tcW w:w="1700" w:type="dxa"/>
+            <w:tcW w:w="1400" w:type="dxa"/>
             <w:tcBorders>
               <w:bottom w:val="single" w:sz="4" w:space="0" w:color="000000"/>
             </w:tcBorders>
@@ -9856,7 +9858,7 @@
         </w:tc>
         <w:tc>
           <w:tcPr>
-            <w:tcW w:w="500" w:type="dxa"/>
+            <w:tcW w:w="400" w:type="dxa"/>
             <w:tcBorders>
               <w:bottom w:val="single" w:sz="4" w:space="0" w:color="000000"/>
             </w:tcBorders>
@@ -9882,7 +9884,7 @@
         </w:tc>
         <w:tc>
           <w:tcPr>
-            <w:tcW w:w="1500" w:type="dxa"/>
+            <w:tcW w:w="900" w:type="dxa"/>
             <w:tcBorders>
               <w:bottom w:val="single" w:sz="4" w:space="0" w:color="000000"/>
             </w:tcBorders>
@@ -9902,13 +9904,13 @@
                 <w:sz w:val="16"/>
                 <w:szCs w:val="16"/>
               </w:rPr>
-              <w:t xml:space="preserve">Mean test FPR</w:t>
-            </w:r>
-          </w:p>
-        </w:tc>
-        <w:tc>
-          <w:tcPr>
-            <w:tcW w:w="1500" w:type="dxa"/>
+              <w:t xml:space="preserve">Seed 42</w:t>
+            </w:r>
+          </w:p>
+        </w:tc>
+        <w:tc>
+          <w:tcPr>
+            <w:tcW w:w="900" w:type="dxa"/>
             <w:tcBorders>
               <w:bottom w:val="single" w:sz="4" w:space="0" w:color="000000"/>
             </w:tcBorders>
@@ -9928,13 +9930,13 @@
                 <w:sz w:val="16"/>
                 <w:szCs w:val="16"/>
               </w:rPr>
-              <w:t xml:space="preserve">False positives (3 seeds)</w:t>
-            </w:r>
-          </w:p>
-        </w:tc>
-        <w:tc>
-          <w:tcPr>
-            <w:tcW w:w="1700" w:type="dxa"/>
+              <w:t xml:space="preserve">Seed 43</w:t>
+            </w:r>
+          </w:p>
+        </w:tc>
+        <w:tc>
+          <w:tcPr>
+            <w:tcW w:w="900" w:type="dxa"/>
             <w:tcBorders>
               <w:bottom w:val="single" w:sz="4" w:space="0" w:color="000000"/>
             </w:tcBorders>
@@ -9954,7 +9956,59 @@
                 <w:sz w:val="16"/>
                 <w:szCs w:val="16"/>
               </w:rPr>
-              <w:t xml:space="preserve">Mean per run (of 120)</w:t>
+              <w:t xml:space="preserve">Seed 44</w:t>
+            </w:r>
+          </w:p>
+        </w:tc>
+        <w:tc>
+          <w:tcPr>
+            <w:tcW w:w="1200" w:type="dxa"/>
+            <w:tcBorders>
+              <w:bottom w:val="single" w:sz="4" w:space="0" w:color="000000"/>
+            </w:tcBorders>
+            <w:vAlign w:val="center"/>
+          </w:tcPr>
+          <w:p>
+            <w:pPr>
+              <w:keepNext/>
+              <w:spacing w:before="10" w:after="10" w:line="216" w:lineRule="auto"/>
+              <w:ind w:firstLine="0"/>
+              <w:jc w:val="center"/>
+            </w:pPr>
+            <w:r>
+              <w:rPr>
+                <w:b/>
+                <w:bCs/>
+                <w:sz w:val="16"/>
+                <w:szCs w:val="16"/>
+              </w:rPr>
+              <w:t xml:space="preserve">Total</w:t>
+            </w:r>
+          </w:p>
+        </w:tc>
+        <w:tc>
+          <w:tcPr>
+            <w:tcW w:w="1218" w:type="dxa"/>
+            <w:tcBorders>
+              <w:bottom w:val="single" w:sz="4" w:space="0" w:color="000000"/>
+            </w:tcBorders>
+            <w:vAlign w:val="center"/>
+          </w:tcPr>
+          <w:p>
+            <w:pPr>
+              <w:keepNext/>
+              <w:spacing w:before="10" w:after="10" w:line="216" w:lineRule="auto"/>
+              <w:ind w:firstLine="0"/>
+              <w:jc w:val="center"/>
+            </w:pPr>
+            <w:r>
+              <w:rPr>
+                <w:b/>
+                <w:bCs/>
+                <w:sz w:val="16"/>
+                <w:szCs w:val="16"/>
+              </w:rPr>
+              <w:t xml:space="preserve">Test FPR</w:t>
             </w:r>
           </w:p>
         </w:tc>
@@ -9965,7 +10019,7 @@
         </w:trPr>
         <w:tc>
           <w:tcPr>
-            <w:tcW w:w="1700" w:type="dxa"/>
+            <w:tcW w:w="1400" w:type="dxa"/>
             <w:vAlign w:val="center"/>
           </w:tcPr>
           <w:p>
@@ -9986,7 +10040,7 @@
         </w:tc>
         <w:tc>
           <w:tcPr>
-            <w:tcW w:w="500" w:type="dxa"/>
+            <w:tcW w:w="400" w:type="dxa"/>
             <w:vAlign w:val="center"/>
           </w:tcPr>
           <w:p>
@@ -10007,7 +10061,91 @@
         </w:tc>
         <w:tc>
           <w:tcPr>
-            <w:tcW w:w="1500" w:type="dxa"/>
+            <w:tcW w:w="900" w:type="dxa"/>
+            <w:vAlign w:val="center"/>
+          </w:tcPr>
+          <w:p>
+            <w:pPr>
+              <w:keepNext/>
+              <w:spacing w:before="10" w:after="10" w:line="216" w:lineRule="auto"/>
+              <w:ind w:firstLine="0"/>
+              <w:jc w:val="center"/>
+            </w:pPr>
+            <w:r>
+              <w:rPr>
+                <w:sz w:val="16"/>
+                <w:szCs w:val="16"/>
+              </w:rPr>
+              <w:t xml:space="preserve">5</w:t>
+            </w:r>
+          </w:p>
+        </w:tc>
+        <w:tc>
+          <w:tcPr>
+            <w:tcW w:w="900" w:type="dxa"/>
+            <w:vAlign w:val="center"/>
+          </w:tcPr>
+          <w:p>
+            <w:pPr>
+              <w:keepNext/>
+              <w:spacing w:before="10" w:after="10" w:line="216" w:lineRule="auto"/>
+              <w:ind w:firstLine="0"/>
+              <w:jc w:val="center"/>
+            </w:pPr>
+            <w:r>
+              <w:rPr>
+                <w:sz w:val="16"/>
+                <w:szCs w:val="16"/>
+              </w:rPr>
+              <w:t xml:space="preserve">5</w:t>
+            </w:r>
+          </w:p>
+        </w:tc>
+        <w:tc>
+          <w:tcPr>
+            <w:tcW w:w="900" w:type="dxa"/>
+            <w:vAlign w:val="center"/>
+          </w:tcPr>
+          <w:p>
+            <w:pPr>
+              <w:keepNext/>
+              <w:spacing w:before="10" w:after="10" w:line="216" w:lineRule="auto"/>
+              <w:ind w:firstLine="0"/>
+              <w:jc w:val="center"/>
+            </w:pPr>
+            <w:r>
+              <w:rPr>
+                <w:sz w:val="16"/>
+                <w:szCs w:val="16"/>
+              </w:rPr>
+              <w:t xml:space="preserve">5</w:t>
+            </w:r>
+          </w:p>
+        </w:tc>
+        <w:tc>
+          <w:tcPr>
+            <w:tcW w:w="1200" w:type="dxa"/>
+            <w:vAlign w:val="center"/>
+          </w:tcPr>
+          <w:p>
+            <w:pPr>
+              <w:keepNext/>
+              <w:spacing w:before="10" w:after="10" w:line="216" w:lineRule="auto"/>
+              <w:ind w:firstLine="0"/>
+              <w:jc w:val="center"/>
+            </w:pPr>
+            <w:r>
+              <w:rPr>
+                <w:sz w:val="16"/>
+                <w:szCs w:val="16"/>
+              </w:rPr>
+              <w:t xml:space="preserve">15/360</w:t>
+            </w:r>
+          </w:p>
+        </w:tc>
+        <w:tc>
+          <w:tcPr>
+            <w:tcW w:w="1218" w:type="dxa"/>
             <w:vAlign w:val="center"/>
           </w:tcPr>
           <w:p>
@@ -10023,48 +10161,6 @@
                 <w:szCs w:val="16"/>
               </w:rPr>
               <w:t xml:space="preserve">0.042</w:t>
-            </w:r>
-          </w:p>
-        </w:tc>
-        <w:tc>
-          <w:tcPr>
-            <w:tcW w:w="1500" w:type="dxa"/>
-            <w:vAlign w:val="center"/>
-          </w:tcPr>
-          <w:p>
-            <w:pPr>
-              <w:keepNext/>
-              <w:spacing w:before="10" w:after="10" w:line="216" w:lineRule="auto"/>
-              <w:ind w:firstLine="0"/>
-              <w:jc w:val="center"/>
-            </w:pPr>
-            <w:r>
-              <w:rPr>
-                <w:sz w:val="16"/>
-                <w:szCs w:val="16"/>
-              </w:rPr>
-              <w:t xml:space="preserve">15/360</w:t>
-            </w:r>
-          </w:p>
-        </w:tc>
-        <w:tc>
-          <w:tcPr>
-            <w:tcW w:w="1700" w:type="dxa"/>
-            <w:vAlign w:val="center"/>
-          </w:tcPr>
-          <w:p>
-            <w:pPr>
-              <w:keepNext/>
-              <w:spacing w:before="10" w:after="10" w:line="216" w:lineRule="auto"/>
-              <w:ind w:firstLine="0"/>
-              <w:jc w:val="center"/>
-            </w:pPr>
-            <w:r>
-              <w:rPr>
-                <w:sz w:val="16"/>
-                <w:szCs w:val="16"/>
-              </w:rPr>
-              <w:t xml:space="preserve">5.00</w:t>
             </w:r>
           </w:p>
         </w:tc>
@@ -10075,7 +10171,7 @@
         </w:trPr>
         <w:tc>
           <w:tcPr>
-            <w:tcW w:w="1700" w:type="dxa"/>
+            <w:tcW w:w="1400" w:type="dxa"/>
             <w:vAlign w:val="center"/>
           </w:tcPr>
           <w:p>
@@ -10089,7 +10185,7 @@
         </w:tc>
         <w:tc>
           <w:tcPr>
-            <w:tcW w:w="500" w:type="dxa"/>
+            <w:tcW w:w="400" w:type="dxa"/>
             <w:vAlign w:val="center"/>
           </w:tcPr>
           <w:p>
@@ -10110,7 +10206,91 @@
         </w:tc>
         <w:tc>
           <w:tcPr>
-            <w:tcW w:w="1500" w:type="dxa"/>
+            <w:tcW w:w="900" w:type="dxa"/>
+            <w:vAlign w:val="center"/>
+          </w:tcPr>
+          <w:p>
+            <w:pPr>
+              <w:keepNext/>
+              <w:spacing w:before="10" w:after="10" w:line="216" w:lineRule="auto"/>
+              <w:ind w:firstLine="0"/>
+              <w:jc w:val="center"/>
+            </w:pPr>
+            <w:r>
+              <w:rPr>
+                <w:sz w:val="16"/>
+                <w:szCs w:val="16"/>
+              </w:rPr>
+              <w:t xml:space="preserve">4</w:t>
+            </w:r>
+          </w:p>
+        </w:tc>
+        <w:tc>
+          <w:tcPr>
+            <w:tcW w:w="900" w:type="dxa"/>
+            <w:vAlign w:val="center"/>
+          </w:tcPr>
+          <w:p>
+            <w:pPr>
+              <w:keepNext/>
+              <w:spacing w:before="10" w:after="10" w:line="216" w:lineRule="auto"/>
+              <w:ind w:firstLine="0"/>
+              <w:jc w:val="center"/>
+            </w:pPr>
+            <w:r>
+              <w:rPr>
+                <w:sz w:val="16"/>
+                <w:szCs w:val="16"/>
+              </w:rPr>
+              <w:t xml:space="preserve">6</w:t>
+            </w:r>
+          </w:p>
+        </w:tc>
+        <w:tc>
+          <w:tcPr>
+            <w:tcW w:w="900" w:type="dxa"/>
+            <w:vAlign w:val="center"/>
+          </w:tcPr>
+          <w:p>
+            <w:pPr>
+              <w:keepNext/>
+              <w:spacing w:before="10" w:after="10" w:line="216" w:lineRule="auto"/>
+              <w:ind w:firstLine="0"/>
+              <w:jc w:val="center"/>
+            </w:pPr>
+            <w:r>
+              <w:rPr>
+                <w:sz w:val="16"/>
+                <w:szCs w:val="16"/>
+              </w:rPr>
+              <w:t xml:space="preserve">5</w:t>
+            </w:r>
+          </w:p>
+        </w:tc>
+        <w:tc>
+          <w:tcPr>
+            <w:tcW w:w="1200" w:type="dxa"/>
+            <w:vAlign w:val="center"/>
+          </w:tcPr>
+          <w:p>
+            <w:pPr>
+              <w:keepNext/>
+              <w:spacing w:before="10" w:after="10" w:line="216" w:lineRule="auto"/>
+              <w:ind w:firstLine="0"/>
+              <w:jc w:val="center"/>
+            </w:pPr>
+            <w:r>
+              <w:rPr>
+                <w:sz w:val="16"/>
+                <w:szCs w:val="16"/>
+              </w:rPr>
+              <w:t xml:space="preserve">15/360</w:t>
+            </w:r>
+          </w:p>
+        </w:tc>
+        <w:tc>
+          <w:tcPr>
+            <w:tcW w:w="1218" w:type="dxa"/>
             <w:vAlign w:val="center"/>
           </w:tcPr>
           <w:p>
@@ -10126,48 +10306,6 @@
                 <w:szCs w:val="16"/>
               </w:rPr>
               <w:t xml:space="preserve">0.042</w:t>
-            </w:r>
-          </w:p>
-        </w:tc>
-        <w:tc>
-          <w:tcPr>
-            <w:tcW w:w="1500" w:type="dxa"/>
-            <w:vAlign w:val="center"/>
-          </w:tcPr>
-          <w:p>
-            <w:pPr>
-              <w:keepNext/>
-              <w:spacing w:before="10" w:after="10" w:line="216" w:lineRule="auto"/>
-              <w:ind w:firstLine="0"/>
-              <w:jc w:val="center"/>
-            </w:pPr>
-            <w:r>
-              <w:rPr>
-                <w:sz w:val="16"/>
-                <w:szCs w:val="16"/>
-              </w:rPr>
-              <w:t xml:space="preserve">15/360</w:t>
-            </w:r>
-          </w:p>
-        </w:tc>
-        <w:tc>
-          <w:tcPr>
-            <w:tcW w:w="1700" w:type="dxa"/>
-            <w:vAlign w:val="center"/>
-          </w:tcPr>
-          <w:p>
-            <w:pPr>
-              <w:keepNext/>
-              <w:spacing w:before="10" w:after="10" w:line="216" w:lineRule="auto"/>
-              <w:ind w:firstLine="0"/>
-              <w:jc w:val="center"/>
-            </w:pPr>
-            <w:r>
-              <w:rPr>
-                <w:sz w:val="16"/>
-                <w:szCs w:val="16"/>
-              </w:rPr>
-              <w:t xml:space="preserve">5.00</w:t>
             </w:r>
           </w:p>
         </w:tc>
@@ -10178,7 +10316,7 @@
         </w:trPr>
         <w:tc>
           <w:tcPr>
-            <w:tcW w:w="1700" w:type="dxa"/>
+            <w:tcW w:w="1400" w:type="dxa"/>
             <w:vAlign w:val="center"/>
           </w:tcPr>
           <w:p>
@@ -10192,7 +10330,7 @@
         </w:tc>
         <w:tc>
           <w:tcPr>
-            <w:tcW w:w="500" w:type="dxa"/>
+            <w:tcW w:w="400" w:type="dxa"/>
             <w:vAlign w:val="center"/>
           </w:tcPr>
           <w:p>
@@ -10213,7 +10351,91 @@
         </w:tc>
         <w:tc>
           <w:tcPr>
-            <w:tcW w:w="1500" w:type="dxa"/>
+            <w:tcW w:w="900" w:type="dxa"/>
+            <w:vAlign w:val="center"/>
+          </w:tcPr>
+          <w:p>
+            <w:pPr>
+              <w:keepNext/>
+              <w:spacing w:before="10" w:after="10" w:line="216" w:lineRule="auto"/>
+              <w:ind w:firstLine="0"/>
+              <w:jc w:val="center"/>
+            </w:pPr>
+            <w:r>
+              <w:rPr>
+                <w:sz w:val="16"/>
+                <w:szCs w:val="16"/>
+              </w:rPr>
+              <w:t xml:space="preserve">6</w:t>
+            </w:r>
+          </w:p>
+        </w:tc>
+        <w:tc>
+          <w:tcPr>
+            <w:tcW w:w="900" w:type="dxa"/>
+            <w:vAlign w:val="center"/>
+          </w:tcPr>
+          <w:p>
+            <w:pPr>
+              <w:keepNext/>
+              <w:spacing w:before="10" w:after="10" w:line="216" w:lineRule="auto"/>
+              <w:ind w:firstLine="0"/>
+              <w:jc w:val="center"/>
+            </w:pPr>
+            <w:r>
+              <w:rPr>
+                <w:sz w:val="16"/>
+                <w:szCs w:val="16"/>
+              </w:rPr>
+              <w:t xml:space="preserve">7</w:t>
+            </w:r>
+          </w:p>
+        </w:tc>
+        <w:tc>
+          <w:tcPr>
+            <w:tcW w:w="900" w:type="dxa"/>
+            <w:vAlign w:val="center"/>
+          </w:tcPr>
+          <w:p>
+            <w:pPr>
+              <w:keepNext/>
+              <w:spacing w:before="10" w:after="10" w:line="216" w:lineRule="auto"/>
+              <w:ind w:firstLine="0"/>
+              <w:jc w:val="center"/>
+            </w:pPr>
+            <w:r>
+              <w:rPr>
+                <w:sz w:val="16"/>
+                <w:szCs w:val="16"/>
+              </w:rPr>
+              <w:t xml:space="preserve">6</w:t>
+            </w:r>
+          </w:p>
+        </w:tc>
+        <w:tc>
+          <w:tcPr>
+            <w:tcW w:w="1200" w:type="dxa"/>
+            <w:vAlign w:val="center"/>
+          </w:tcPr>
+          <w:p>
+            <w:pPr>
+              <w:keepNext/>
+              <w:spacing w:before="10" w:after="10" w:line="216" w:lineRule="auto"/>
+              <w:ind w:firstLine="0"/>
+              <w:jc w:val="center"/>
+            </w:pPr>
+            <w:r>
+              <w:rPr>
+                <w:sz w:val="16"/>
+                <w:szCs w:val="16"/>
+              </w:rPr>
+              <w:t xml:space="preserve">19/360</w:t>
+            </w:r>
+          </w:p>
+        </w:tc>
+        <w:tc>
+          <w:tcPr>
+            <w:tcW w:w="1218" w:type="dxa"/>
             <w:vAlign w:val="center"/>
           </w:tcPr>
           <w:p>
@@ -10229,48 +10451,6 @@
                 <w:szCs w:val="16"/>
               </w:rPr>
               <w:t xml:space="preserve">0.053</w:t>
-            </w:r>
-          </w:p>
-        </w:tc>
-        <w:tc>
-          <w:tcPr>
-            <w:tcW w:w="1500" w:type="dxa"/>
-            <w:vAlign w:val="center"/>
-          </w:tcPr>
-          <w:p>
-            <w:pPr>
-              <w:keepNext/>
-              <w:spacing w:before="10" w:after="10" w:line="216" w:lineRule="auto"/>
-              <w:ind w:firstLine="0"/>
-              <w:jc w:val="center"/>
-            </w:pPr>
-            <w:r>
-              <w:rPr>
-                <w:sz w:val="16"/>
-                <w:szCs w:val="16"/>
-              </w:rPr>
-              <w:t xml:space="preserve">19/360</w:t>
-            </w:r>
-          </w:p>
-        </w:tc>
-        <w:tc>
-          <w:tcPr>
-            <w:tcW w:w="1700" w:type="dxa"/>
-            <w:vAlign w:val="center"/>
-          </w:tcPr>
-          <w:p>
-            <w:pPr>
-              <w:keepNext/>
-              <w:spacing w:before="10" w:after="10" w:line="216" w:lineRule="auto"/>
-              <w:ind w:firstLine="0"/>
-              <w:jc w:val="center"/>
-            </w:pPr>
-            <w:r>
-              <w:rPr>
-                <w:sz w:val="16"/>
-                <w:szCs w:val="16"/>
-              </w:rPr>
-              <w:t xml:space="preserve">6.33</w:t>
             </w:r>
           </w:p>
         </w:tc>
@@ -10281,7 +10461,7 @@
         </w:trPr>
         <w:tc>
           <w:tcPr>
-            <w:tcW w:w="1700" w:type="dxa"/>
+            <w:tcW w:w="1400" w:type="dxa"/>
             <w:tcBorders>
               <w:top w:val="single" w:sz="4" w:space="0" w:color="000000"/>
             </w:tcBorders>
@@ -10305,7 +10485,7 @@
         </w:tc>
         <w:tc>
           <w:tcPr>
-            <w:tcW w:w="500" w:type="dxa"/>
+            <w:tcW w:w="400" w:type="dxa"/>
             <w:tcBorders>
               <w:top w:val="single" w:sz="4" w:space="0" w:color="000000"/>
             </w:tcBorders>
@@ -10329,7 +10509,7 @@
         </w:tc>
         <w:tc>
           <w:tcPr>
-            <w:tcW w:w="1500" w:type="dxa"/>
+            <w:tcW w:w="900" w:type="dxa"/>
             <w:tcBorders>
               <w:top w:val="single" w:sz="4" w:space="0" w:color="000000"/>
             </w:tcBorders>
@@ -10347,13 +10527,13 @@
                 <w:sz w:val="16"/>
                 <w:szCs w:val="16"/>
               </w:rPr>
-              <w:t xml:space="preserve">0.050</w:t>
-            </w:r>
-          </w:p>
-        </w:tc>
-        <w:tc>
-          <w:tcPr>
-            <w:tcW w:w="1500" w:type="dxa"/>
+              <w:t xml:space="preserve">7</w:t>
+            </w:r>
+          </w:p>
+        </w:tc>
+        <w:tc>
+          <w:tcPr>
+            <w:tcW w:w="900" w:type="dxa"/>
             <w:tcBorders>
               <w:top w:val="single" w:sz="4" w:space="0" w:color="000000"/>
             </w:tcBorders>
@@ -10371,13 +10551,13 @@
                 <w:sz w:val="16"/>
                 <w:szCs w:val="16"/>
               </w:rPr>
-              <w:t xml:space="preserve">18/360</w:t>
-            </w:r>
-          </w:p>
-        </w:tc>
-        <w:tc>
-          <w:tcPr>
-            <w:tcW w:w="1700" w:type="dxa"/>
+              <w:t xml:space="preserve">3</w:t>
+            </w:r>
+          </w:p>
+        </w:tc>
+        <w:tc>
+          <w:tcPr>
+            <w:tcW w:w="900" w:type="dxa"/>
             <w:tcBorders>
               <w:top w:val="single" w:sz="4" w:space="0" w:color="000000"/>
             </w:tcBorders>
@@ -10395,7 +10575,55 @@
                 <w:sz w:val="16"/>
                 <w:szCs w:val="16"/>
               </w:rPr>
-              <w:t xml:space="preserve">6.00</w:t>
+              <w:t xml:space="preserve">8</w:t>
+            </w:r>
+          </w:p>
+        </w:tc>
+        <w:tc>
+          <w:tcPr>
+            <w:tcW w:w="1200" w:type="dxa"/>
+            <w:tcBorders>
+              <w:top w:val="single" w:sz="4" w:space="0" w:color="000000"/>
+            </w:tcBorders>
+            <w:vAlign w:val="center"/>
+          </w:tcPr>
+          <w:p>
+            <w:pPr>
+              <w:keepNext/>
+              <w:spacing w:before="10" w:after="10" w:line="216" w:lineRule="auto"/>
+              <w:ind w:firstLine="0"/>
+              <w:jc w:val="center"/>
+            </w:pPr>
+            <w:r>
+              <w:rPr>
+                <w:sz w:val="16"/>
+                <w:szCs w:val="16"/>
+              </w:rPr>
+              <w:t xml:space="preserve">18/360</w:t>
+            </w:r>
+          </w:p>
+        </w:tc>
+        <w:tc>
+          <w:tcPr>
+            <w:tcW w:w="1218" w:type="dxa"/>
+            <w:tcBorders>
+              <w:top w:val="single" w:sz="4" w:space="0" w:color="000000"/>
+            </w:tcBorders>
+            <w:vAlign w:val="center"/>
+          </w:tcPr>
+          <w:p>
+            <w:pPr>
+              <w:keepNext/>
+              <w:spacing w:before="10" w:after="10" w:line="216" w:lineRule="auto"/>
+              <w:ind w:firstLine="0"/>
+              <w:jc w:val="center"/>
+            </w:pPr>
+            <w:r>
+              <w:rPr>
+                <w:sz w:val="16"/>
+                <w:szCs w:val="16"/>
+              </w:rPr>
+              <w:t xml:space="preserve">0.050</w:t>
             </w:r>
           </w:p>
         </w:tc>
@@ -10406,7 +10634,7 @@
         </w:trPr>
         <w:tc>
           <w:tcPr>
-            <w:tcW w:w="1700" w:type="dxa"/>
+            <w:tcW w:w="1400" w:type="dxa"/>
             <w:vAlign w:val="center"/>
           </w:tcPr>
           <w:p>
@@ -10420,7 +10648,7 @@
         </w:tc>
         <w:tc>
           <w:tcPr>
-            <w:tcW w:w="500" w:type="dxa"/>
+            <w:tcW w:w="400" w:type="dxa"/>
             <w:vAlign w:val="center"/>
           </w:tcPr>
           <w:p>
@@ -10441,7 +10669,91 @@
         </w:tc>
         <w:tc>
           <w:tcPr>
-            <w:tcW w:w="1500" w:type="dxa"/>
+            <w:tcW w:w="900" w:type="dxa"/>
+            <w:vAlign w:val="center"/>
+          </w:tcPr>
+          <w:p>
+            <w:pPr>
+              <w:keepNext/>
+              <w:spacing w:before="10" w:after="10" w:line="216" w:lineRule="auto"/>
+              <w:ind w:firstLine="0"/>
+              <w:jc w:val="center"/>
+            </w:pPr>
+            <w:r>
+              <w:rPr>
+                <w:sz w:val="16"/>
+                <w:szCs w:val="16"/>
+              </w:rPr>
+              <w:t xml:space="preserve">7</w:t>
+            </w:r>
+          </w:p>
+        </w:tc>
+        <w:tc>
+          <w:tcPr>
+            <w:tcW w:w="900" w:type="dxa"/>
+            <w:vAlign w:val="center"/>
+          </w:tcPr>
+          <w:p>
+            <w:pPr>
+              <w:keepNext/>
+              <w:spacing w:before="10" w:after="10" w:line="216" w:lineRule="auto"/>
+              <w:ind w:firstLine="0"/>
+              <w:jc w:val="center"/>
+            </w:pPr>
+            <w:r>
+              <w:rPr>
+                <w:sz w:val="16"/>
+                <w:szCs w:val="16"/>
+              </w:rPr>
+              <w:t xml:space="preserve">2</w:t>
+            </w:r>
+          </w:p>
+        </w:tc>
+        <w:tc>
+          <w:tcPr>
+            <w:tcW w:w="900" w:type="dxa"/>
+            <w:vAlign w:val="center"/>
+          </w:tcPr>
+          <w:p>
+            <w:pPr>
+              <w:keepNext/>
+              <w:spacing w:before="10" w:after="10" w:line="216" w:lineRule="auto"/>
+              <w:ind w:firstLine="0"/>
+              <w:jc w:val="center"/>
+            </w:pPr>
+            <w:r>
+              <w:rPr>
+                <w:sz w:val="16"/>
+                <w:szCs w:val="16"/>
+              </w:rPr>
+              <w:t xml:space="preserve">2</w:t>
+            </w:r>
+          </w:p>
+        </w:tc>
+        <w:tc>
+          <w:tcPr>
+            <w:tcW w:w="1200" w:type="dxa"/>
+            <w:vAlign w:val="center"/>
+          </w:tcPr>
+          <w:p>
+            <w:pPr>
+              <w:keepNext/>
+              <w:spacing w:before="10" w:after="10" w:line="216" w:lineRule="auto"/>
+              <w:ind w:firstLine="0"/>
+              <w:jc w:val="center"/>
+            </w:pPr>
+            <w:r>
+              <w:rPr>
+                <w:sz w:val="16"/>
+                <w:szCs w:val="16"/>
+              </w:rPr>
+              <w:t xml:space="preserve">11/360</w:t>
+            </w:r>
+          </w:p>
+        </w:tc>
+        <w:tc>
+          <w:tcPr>
+            <w:tcW w:w="1218" w:type="dxa"/>
             <w:vAlign w:val="center"/>
           </w:tcPr>
           <w:p>
@@ -10457,48 +10769,6 @@
                 <w:szCs w:val="16"/>
               </w:rPr>
               <w:t xml:space="preserve">0.031</w:t>
-            </w:r>
-          </w:p>
-        </w:tc>
-        <w:tc>
-          <w:tcPr>
-            <w:tcW w:w="1500" w:type="dxa"/>
-            <w:vAlign w:val="center"/>
-          </w:tcPr>
-          <w:p>
-            <w:pPr>
-              <w:keepNext/>
-              <w:spacing w:before="10" w:after="10" w:line="216" w:lineRule="auto"/>
-              <w:ind w:firstLine="0"/>
-              <w:jc w:val="center"/>
-            </w:pPr>
-            <w:r>
-              <w:rPr>
-                <w:sz w:val="16"/>
-                <w:szCs w:val="16"/>
-              </w:rPr>
-              <w:t xml:space="preserve">11/360</w:t>
-            </w:r>
-          </w:p>
-        </w:tc>
-        <w:tc>
-          <w:tcPr>
-            <w:tcW w:w="1700" w:type="dxa"/>
-            <w:vAlign w:val="center"/>
-          </w:tcPr>
-          <w:p>
-            <w:pPr>
-              <w:keepNext/>
-              <w:spacing w:before="10" w:after="10" w:line="216" w:lineRule="auto"/>
-              <w:ind w:firstLine="0"/>
-              <w:jc w:val="center"/>
-            </w:pPr>
-            <w:r>
-              <w:rPr>
-                <w:sz w:val="16"/>
-                <w:szCs w:val="16"/>
-              </w:rPr>
-              <w:t xml:space="preserve">3.67</w:t>
             </w:r>
           </w:p>
         </w:tc>
@@ -10509,7 +10779,7 @@
         </w:trPr>
         <w:tc>
           <w:tcPr>
-            <w:tcW w:w="1700" w:type="dxa"/>
+            <w:tcW w:w="1400" w:type="dxa"/>
             <w:vAlign w:val="center"/>
           </w:tcPr>
           <w:p>
@@ -10522,7 +10792,7 @@
         </w:tc>
         <w:tc>
           <w:tcPr>
-            <w:tcW w:w="500" w:type="dxa"/>
+            <w:tcW w:w="400" w:type="dxa"/>
             <w:vAlign w:val="center"/>
           </w:tcPr>
           <w:p>
@@ -10542,7 +10812,87 @@
         </w:tc>
         <w:tc>
           <w:tcPr>
-            <w:tcW w:w="1500" w:type="dxa"/>
+            <w:tcW w:w="900" w:type="dxa"/>
+            <w:vAlign w:val="center"/>
+          </w:tcPr>
+          <w:p>
+            <w:pPr>
+              <w:spacing w:before="10" w:after="10" w:line="216" w:lineRule="auto"/>
+              <w:ind w:firstLine="0"/>
+              <w:jc w:val="center"/>
+            </w:pPr>
+            <w:r>
+              <w:rPr>
+                <w:sz w:val="16"/>
+                <w:szCs w:val="16"/>
+              </w:rPr>
+              <w:t xml:space="preserve">5</w:t>
+            </w:r>
+          </w:p>
+        </w:tc>
+        <w:tc>
+          <w:tcPr>
+            <w:tcW w:w="900" w:type="dxa"/>
+            <w:vAlign w:val="center"/>
+          </w:tcPr>
+          <w:p>
+            <w:pPr>
+              <w:spacing w:before="10" w:after="10" w:line="216" w:lineRule="auto"/>
+              <w:ind w:firstLine="0"/>
+              <w:jc w:val="center"/>
+            </w:pPr>
+            <w:r>
+              <w:rPr>
+                <w:sz w:val="16"/>
+                <w:szCs w:val="16"/>
+              </w:rPr>
+              <w:t xml:space="preserve">1</w:t>
+            </w:r>
+          </w:p>
+        </w:tc>
+        <w:tc>
+          <w:tcPr>
+            <w:tcW w:w="900" w:type="dxa"/>
+            <w:vAlign w:val="center"/>
+          </w:tcPr>
+          <w:p>
+            <w:pPr>
+              <w:spacing w:before="10" w:after="10" w:line="216" w:lineRule="auto"/>
+              <w:ind w:firstLine="0"/>
+              <w:jc w:val="center"/>
+            </w:pPr>
+            <w:r>
+              <w:rPr>
+                <w:sz w:val="16"/>
+                <w:szCs w:val="16"/>
+              </w:rPr>
+              <w:t xml:space="preserve">2</w:t>
+            </w:r>
+          </w:p>
+        </w:tc>
+        <w:tc>
+          <w:tcPr>
+            <w:tcW w:w="1200" w:type="dxa"/>
+            <w:vAlign w:val="center"/>
+          </w:tcPr>
+          <w:p>
+            <w:pPr>
+              <w:spacing w:before="10" w:after="10" w:line="216" w:lineRule="auto"/>
+              <w:ind w:firstLine="0"/>
+              <w:jc w:val="center"/>
+            </w:pPr>
+            <w:r>
+              <w:rPr>
+                <w:sz w:val="16"/>
+                <w:szCs w:val="16"/>
+              </w:rPr>
+              <w:t xml:space="preserve">8/360</w:t>
+            </w:r>
+          </w:p>
+        </w:tc>
+        <w:tc>
+          <w:tcPr>
+            <w:tcW w:w="1218" w:type="dxa"/>
             <w:vAlign w:val="center"/>
           </w:tcPr>
           <w:p>
@@ -10557,46 +10907,6 @@
                 <w:szCs w:val="16"/>
               </w:rPr>
               <w:t xml:space="preserve">0.022</w:t>
-            </w:r>
-          </w:p>
-        </w:tc>
-        <w:tc>
-          <w:tcPr>
-            <w:tcW w:w="1500" w:type="dxa"/>
-            <w:vAlign w:val="center"/>
-          </w:tcPr>
-          <w:p>
-            <w:pPr>
-              <w:spacing w:before="10" w:after="10" w:line="216" w:lineRule="auto"/>
-              <w:ind w:firstLine="0"/>
-              <w:jc w:val="center"/>
-            </w:pPr>
-            <w:r>
-              <w:rPr>
-                <w:sz w:val="16"/>
-                <w:szCs w:val="16"/>
-              </w:rPr>
-              <w:t xml:space="preserve">8/360</w:t>
-            </w:r>
-          </w:p>
-        </w:tc>
-        <w:tc>
-          <w:tcPr>
-            <w:tcW w:w="1700" w:type="dxa"/>
-            <w:vAlign w:val="center"/>
-          </w:tcPr>
-          <w:p>
-            <w:pPr>
-              <w:spacing w:before="10" w:after="10" w:line="216" w:lineRule="auto"/>
-              <w:ind w:firstLine="0"/>
-              <w:jc w:val="center"/>
-            </w:pPr>
-            <w:r>
-              <w:rPr>
-                <w:sz w:val="16"/>
-                <w:szCs w:val="16"/>
-              </w:rPr>
-              <w:t xml:space="preserve">2.67</w:t>
             </w:r>
           </w:p>
         </w:tc>
@@ -10606,6 +10916,21 @@
       <w:pPr>
         <w:spacing w:before="0" w:after="0" w:line="120" w:lineRule="exact"/>
       </w:pPr>
+    </w:p>
+    <w:p>
+      <w:pPr>
+        <w:pStyle w:val="p1a"/>
+      </w:pPr>
+      <w:r>
+        <w:rPr>
+          <w:b/>
+          <w:bCs/>
+        </w:rPr>
+        <w:t xml:space="preserve">Software.</w:t>
+      </w:r>
+      <w:r>
+        <w:t xml:space="preserve"> All values in Tables S1-S3 and in the manuscript were reproduced from the 600 source images with Python 3.13, NumPy 2.5.3 (OpenBLAS, Haswell kernel), SciPy 1.18.1, scikit-learn 1.9.1, conseal 2025.11 and sealwatch 2025.9.</w:t>
+      </w:r>
     </w:p>
     <w:sectPr>
       <w:pgSz w:w="11906" w:h="16838" w:code="9"/>

</xml_diff>